<commit_message>
feat(tabs): links from the Word narrative to a question (story stage 3)
In Word the author selects words, presses Ctrl+K and types turas:Q12.
Word 16 stores that as a w:hyperlink whose External relationship has
Target="turas:Q12" verbatim (proved on a document Word saved, 23 Sep 2026).

The reader keeps link = "Q12" on those runs; runs merge only when their
links match. build_data_layer drops a link whose code is not a question in
the report, with a console line naming the words and the code. The JS
repeats that check, renders the words as an in-page link
(#tab=crosstabs&q=Q12, never the turas: address) on the Report tab, the
cover, the story card and Present, and a click opens the question under a
return point. Both decks show the words as plain text.

Also fixes a partial match: with no narrative screens, config_obj$narrative
read narrative_file and put that setting's text on the island.

Co-Authored-By: Claude Opus 5.5 <noreply@anthropic.com>
</commit_message>
<xml_diff>
--- a/modules/tabs/tests/fixtures/narrative/narrative_fixture.docx
+++ b/modules/tabs/tests/fixtures/narrative/narrative_fixture.docx
@@ -66,8 +66,16 @@
         <w:pStyle w:val="Kop2"/>
       </w:pPr>
       <w:r>
-        <w:t xml:space="preserve">How we asked</w:t>
-      </w:r>
+        <w:t xml:space="preserve">How we </w:t>
+      </w:r>
+      <w:hyperlink r:id="rIdTurasHead" w:history="1">
+        <w:r>
+          <w:rPr>
+            <w:rStyle w:val="Hyperlink"/>
+          </w:rPr>
+          <w:t xml:space="preserve">asked</w:t>
+        </w:r>
+      </w:hyperlink>
     </w:p>
     <w:p>
       <w:pPr>
@@ -102,12 +110,31 @@
         </w:numPr>
       </w:pPr>
       <w:r>
-        <w:t xml:space="preserve">Two reminders</w:t>
-      </w:r>
-    </w:p>
-    <w:p>
-      <w:r>
-        <w:t xml:space="preserve">A paragraph between lists.</w:t>
+        <w:t xml:space="preserve">Two </w:t>
+      </w:r>
+      <w:hyperlink r:id="rIdTuras2" w:history="1">
+        <w:r>
+          <w:rPr>
+            <w:rStyle w:val="Hyperlink"/>
+          </w:rPr>
+          <w:t xml:space="preserve">reminders</w:t>
+        </w:r>
+      </w:hyperlink>
+    </w:p>
+    <w:p>
+      <w:r>
+        <w:t xml:space="preserve">A paragraph </w:t>
+      </w:r>
+      <w:hyperlink r:id="rIdTurasGone" w:history="1">
+        <w:r>
+          <w:rPr>
+            <w:rStyle w:val="Hyperlink"/>
+          </w:rPr>
+          <w:t xml:space="preserve">between lists</w:t>
+        </w:r>
+      </w:hyperlink>
+      <w:r>
+        <w:t xml:space="preserve">.</w:t>
       </w:r>
     </w:p>
     <w:p>
@@ -256,8 +283,22 @@
     </w:p>
     <w:p>
       <w:commentRangeStart w:id="0"/>
-      <w:r>
-        <w:t xml:space="preserve">Ratings are stable.</w:t>
+      <w:hyperlink r:id="rIdTuras1" w:history="1">
+        <w:r>
+          <w:rPr>
+            <w:rStyle w:val="Hyperlink"/>
+          </w:rPr>
+          <w:t xml:space="preserve">Rat</w:t>
+        </w:r>
+        <w:r>
+          <w:rPr>
+            <w:rStyle w:val="Hyperlink"/>
+          </w:rPr>
+          <w:t xml:space="preserve">ings</w:t>
+        </w:r>
+      </w:hyperlink>
+      <w:r>
+        <w:t xml:space="preserve"> are stable.</w:t>
       </w:r>
       <w:commentRangeEnd w:id="0"/>
       <w:r>
@@ -610,8 +651,13 @@
       </w:r>
     </w:p>
     <w:p>
-      <w:r>
-        <w:t xml:space="preserve">Second occurrence.</w:t>
+      <w:hyperlink w:anchor="_Toc1" w:history="1">
+        <w:r>
+          <w:t xml:space="preserve">Second</w:t>
+        </w:r>
+      </w:hyperlink>
+      <w:r>
+        <w:t xml:space="preserve"> occurrence.</w:t>
       </w:r>
     </w:p>
     <w:sectPr>

</xml_diff>